<commit_message>
feat: apply major updates, fix AI text generation bug, and restructure to src/
</commit_message>
<xml_diff>
--- a/使い方/260415_5年目事前課題マニュアル.docx
+++ b/使い方/260415_5年目事前課題マニュアル.docx
@@ -127,6 +127,7 @@
         <w:spacing w:after="40"/>
         <w:rPr>
           <w:color w:val="000000" w:themeColor="text1"/>
+          <w:sz w:val="19"/>
           <w:lang w:eastAsia="ja-JP"/>
         </w:rPr>
       </w:pPr>
@@ -136,7 +137,24 @@
           <w:sz w:val="19"/>
           <w:lang w:eastAsia="ja-JP"/>
         </w:rPr>
-        <w:t>お名前（フルネーム／ニックネーム可）を入力し、MBTI性格診断の質問に直感でお答えください。AIがあなたに最適なアプローチで質問するための準備となります。</w:t>
+        <w:t>お名前（フルネーム／ニックネーム可）を入力し、MBTI性格診断の質問に直感でお答えください。</w:t>
+      </w:r>
+    </w:p>
+    <w:p>
+      <w:pPr>
+        <w:spacing w:after="40"/>
+        <w:rPr>
+          <w:color w:val="000000" w:themeColor="text1"/>
+          <w:lang w:eastAsia="ja-JP"/>
+        </w:rPr>
+      </w:pPr>
+      <w:r>
+        <w:rPr>
+          <w:color w:val="000000" w:themeColor="text1"/>
+          <w:sz w:val="19"/>
+          <w:lang w:eastAsia="ja-JP"/>
+        </w:rPr>
+        <w:t>AIがあなたに最適なアプローチで質問するための準備となります。</w:t>
       </w:r>
     </w:p>
     <w:p>

</xml_diff>